<commit_message>
Programme Management: Replace PCH-001 Programme Charter with controlled production version
</commit_message>
<xml_diff>
--- a/tooling/ProgrammeManagement/00 Programme Office/PCH-001 Programme Charter.docx
+++ b/tooling/ProgrammeManagement/00 Programme Office/PCH-001 Programme Charter.docx
@@ -4,35 +4,44 @@
   <w:body>
     <w:p>
       <w:pPr>
-        <w:pStyle w:val="Heading1"/>
+        <w:jc w:val="center"/>
       </w:pPr>
       <w:r>
-        <w:t>JUSTDEFENDERS® PROGRAMME MANAGEMENT SYSTEM</w:t>
+        <w:rPr>
+          <w:b/>
+          <w:sz w:val="48"/>
+        </w:rPr>
+        <w:t>PCH-001</w:t>
+        <w:br/>
+        <w:t>Programme Charter</w:t>
+      </w:r>
+    </w:p>
+    <w:p>
+      <w:r>
+        <w:t>Repository: tooling\ProgrammeManagement\00 Programme Office\</w:t>
+      </w:r>
+    </w:p>
+    <w:p>
+      <w:r>
+        <w:t>Filename: PCH-001 Programme Charter.docx</w:t>
+      </w:r>
+    </w:p>
+    <w:p>
+      <w:r>
+        <w:br w:type="page"/>
       </w:r>
     </w:p>
     <w:p>
       <w:pPr>
-        <w:pStyle w:val="Heading2"/>
+        <w:pStyle w:val="Heading1"/>
       </w:pPr>
       <w:r>
-        <w:t>PCH-001 Programme Charter</w:t>
-      </w:r>
-    </w:p>
-    <w:p>
-      <w:r>
-        <w:t>Defines the programme mission, objectives, governance and success criteria.</w:t>
-      </w:r>
-    </w:p>
-    <w:p>
-      <w:pPr>
-        <w:pStyle w:val="Heading2"/>
-      </w:pPr>
-      <w:r>
-        <w:t>Engineering Control</w:t>
+        <w:t>Engineering Control Record</w:t>
       </w:r>
     </w:p>
     <w:tbl>
       <w:tblPr>
+        <w:tblStyle w:val="TableGrid"/>
         <w:tblW w:type="auto" w:w="0"/>
         <w:tblLook w:firstColumn="1" w:firstRow="1" w:lastColumn="0" w:lastRow="0" w:noHBand="0" w:noVBand="1" w:val="04A0"/>
       </w:tblPr>
@@ -40,6 +49,72 @@
         <w:gridCol w:w="4320"/>
         <w:gridCol w:w="4320"/>
       </w:tblGrid>
+      <w:tr>
+        <w:tc>
+          <w:tcPr>
+            <w:tcW w:type="dxa" w:w="4320"/>
+          </w:tcPr>
+          <w:p>
+            <w:r>
+              <w:t>Field</w:t>
+            </w:r>
+          </w:p>
+        </w:tc>
+        <w:tc>
+          <w:tcPr>
+            <w:tcW w:type="dxa" w:w="4320"/>
+          </w:tcPr>
+          <w:p>
+            <w:r>
+              <w:t>Value</w:t>
+            </w:r>
+          </w:p>
+        </w:tc>
+      </w:tr>
+      <w:tr>
+        <w:tc>
+          <w:tcPr>
+            <w:tcW w:type="dxa" w:w="4320"/>
+          </w:tcPr>
+          <w:p>
+            <w:r>
+              <w:t>Document ID</w:t>
+            </w:r>
+          </w:p>
+        </w:tc>
+        <w:tc>
+          <w:tcPr>
+            <w:tcW w:type="dxa" w:w="4320"/>
+          </w:tcPr>
+          <w:p>
+            <w:r>
+              <w:t>PCH-001</w:t>
+            </w:r>
+          </w:p>
+        </w:tc>
+      </w:tr>
+      <w:tr>
+        <w:tc>
+          <w:tcPr>
+            <w:tcW w:type="dxa" w:w="4320"/>
+          </w:tcPr>
+          <w:p>
+            <w:r>
+              <w:t>Title</w:t>
+            </w:r>
+          </w:p>
+        </w:tc>
+        <w:tc>
+          <w:tcPr>
+            <w:tcW w:type="dxa" w:w="4320"/>
+          </w:tcPr>
+          <w:p>
+            <w:r>
+              <w:t>Programme Charter</w:t>
+            </w:r>
+          </w:p>
+        </w:tc>
+      </w:tr>
       <w:tr>
         <w:tc>
           <w:tcPr>
@@ -58,6 +133,94 @@
           <w:p>
             <w:r>
               <w:t>CONTROLLED</w:t>
+            </w:r>
+          </w:p>
+        </w:tc>
+      </w:tr>
+      <w:tr>
+        <w:tc>
+          <w:tcPr>
+            <w:tcW w:type="dxa" w:w="4320"/>
+          </w:tcPr>
+          <w:p>
+            <w:r>
+              <w:t>Version</w:t>
+            </w:r>
+          </w:p>
+        </w:tc>
+        <w:tc>
+          <w:tcPr>
+            <w:tcW w:type="dxa" w:w="4320"/>
+          </w:tcPr>
+          <w:p>
+            <w:r>
+              <w:t>1.0</w:t>
+            </w:r>
+          </w:p>
+        </w:tc>
+      </w:tr>
+      <w:tr>
+        <w:tc>
+          <w:tcPr>
+            <w:tcW w:type="dxa" w:w="4320"/>
+          </w:tcPr>
+          <w:p>
+            <w:r>
+              <w:t>Owner</w:t>
+            </w:r>
+          </w:p>
+        </w:tc>
+        <w:tc>
+          <w:tcPr>
+            <w:tcW w:type="dxa" w:w="4320"/>
+          </w:tcPr>
+          <w:p>
+            <w:r>
+              <w:t>Programme Office</w:t>
+            </w:r>
+          </w:p>
+        </w:tc>
+      </w:tr>
+      <w:tr>
+        <w:tc>
+          <w:tcPr>
+            <w:tcW w:type="dxa" w:w="4320"/>
+          </w:tcPr>
+          <w:p>
+            <w:r>
+              <w:t>Repository Path</w:t>
+            </w:r>
+          </w:p>
+        </w:tc>
+        <w:tc>
+          <w:tcPr>
+            <w:tcW w:type="dxa" w:w="4320"/>
+          </w:tcPr>
+          <w:p>
+            <w:r>
+              <w:t>tooling\ProgrammeManagement\00 Programme Office\</w:t>
+            </w:r>
+          </w:p>
+        </w:tc>
+      </w:tr>
+      <w:tr>
+        <w:tc>
+          <w:tcPr>
+            <w:tcW w:type="dxa" w:w="4320"/>
+          </w:tcPr>
+          <w:p>
+            <w:r>
+              <w:t>Filename</w:t>
+            </w:r>
+          </w:p>
+        </w:tc>
+        <w:tc>
+          <w:tcPr>
+            <w:tcW w:type="dxa" w:w="4320"/>
+          </w:tcPr>
+          <w:p>
+            <w:r>
+              <w:t>PCH-001 Programme Charter.docx</w:t>
             </w:r>
           </w:p>
         </w:tc>
@@ -91,7 +254,461 @@
           </w:tcPr>
           <w:p>
             <w:r>
-              <w:t>Repository Path</w:t>
+              <w:t>Last Updated</w:t>
+            </w:r>
+          </w:p>
+        </w:tc>
+        <w:tc>
+          <w:tcPr>
+            <w:tcW w:type="dxa" w:w="4320"/>
+          </w:tcPr>
+          <w:p>
+            <w:r/>
+          </w:p>
+        </w:tc>
+      </w:tr>
+      <w:tr>
+        <w:tc>
+          <w:tcPr>
+            <w:tcW w:type="dxa" w:w="4320"/>
+          </w:tcPr>
+          <w:p>
+            <w:r>
+              <w:t>Next Review</w:t>
+            </w:r>
+          </w:p>
+        </w:tc>
+        <w:tc>
+          <w:tcPr>
+            <w:tcW w:type="dxa" w:w="4320"/>
+          </w:tcPr>
+          <w:p>
+            <w:r/>
+          </w:p>
+        </w:tc>
+      </w:tr>
+    </w:tbl>
+    <w:p>
+      <w:pPr>
+        <w:pStyle w:val="Heading1"/>
+      </w:pPr>
+      <w:r>
+        <w:t>Revision History</w:t>
+      </w:r>
+    </w:p>
+    <w:tbl>
+      <w:tblPr>
+        <w:tblStyle w:val="TableGrid"/>
+        <w:tblW w:type="auto" w:w="0"/>
+        <w:tblLook w:firstColumn="1" w:firstRow="1" w:lastColumn="0" w:lastRow="0" w:noHBand="0" w:noVBand="1" w:val="04A0"/>
+      </w:tblPr>
+      <w:tblGrid>
+        <w:gridCol w:w="1728"/>
+        <w:gridCol w:w="1728"/>
+        <w:gridCol w:w="1728"/>
+        <w:gridCol w:w="1728"/>
+        <w:gridCol w:w="1728"/>
+      </w:tblGrid>
+      <w:tr>
+        <w:tc>
+          <w:tcPr>
+            <w:tcW w:type="dxa" w:w="1728"/>
+          </w:tcPr>
+          <w:p>
+            <w:r>
+              <w:t>Version</w:t>
+            </w:r>
+          </w:p>
+        </w:tc>
+        <w:tc>
+          <w:tcPr>
+            <w:tcW w:type="dxa" w:w="1728"/>
+          </w:tcPr>
+          <w:p>
+            <w:r>
+              <w:t>Date</w:t>
+            </w:r>
+          </w:p>
+        </w:tc>
+        <w:tc>
+          <w:tcPr>
+            <w:tcW w:type="dxa" w:w="1728"/>
+          </w:tcPr>
+          <w:p>
+            <w:r>
+              <w:t>Author</w:t>
+            </w:r>
+          </w:p>
+        </w:tc>
+        <w:tc>
+          <w:tcPr>
+            <w:tcW w:type="dxa" w:w="1728"/>
+          </w:tcPr>
+          <w:p>
+            <w:r>
+              <w:t>Change</w:t>
+            </w:r>
+          </w:p>
+        </w:tc>
+        <w:tc>
+          <w:tcPr>
+            <w:tcW w:type="dxa" w:w="1728"/>
+          </w:tcPr>
+          <w:p>
+            <w:r>
+              <w:t>Status</w:t>
+            </w:r>
+          </w:p>
+        </w:tc>
+      </w:tr>
+      <w:tr>
+        <w:tc>
+          <w:tcPr>
+            <w:tcW w:type="dxa" w:w="1728"/>
+          </w:tcPr>
+          <w:p>
+            <w:r>
+              <w:t>1.0</w:t>
+            </w:r>
+          </w:p>
+        </w:tc>
+        <w:tc>
+          <w:tcPr>
+            <w:tcW w:type="dxa" w:w="1728"/>
+          </w:tcPr>
+          <w:p>
+            <w:r/>
+          </w:p>
+        </w:tc>
+        <w:tc>
+          <w:tcPr>
+            <w:tcW w:type="dxa" w:w="1728"/>
+          </w:tcPr>
+          <w:p>
+            <w:r>
+              <w:t>Programme Office</w:t>
+            </w:r>
+          </w:p>
+        </w:tc>
+        <w:tc>
+          <w:tcPr>
+            <w:tcW w:type="dxa" w:w="1728"/>
+          </w:tcPr>
+          <w:p>
+            <w:r>
+              <w:t>Initial Issue</w:t>
+            </w:r>
+          </w:p>
+        </w:tc>
+        <w:tc>
+          <w:tcPr>
+            <w:tcW w:type="dxa" w:w="1728"/>
+          </w:tcPr>
+          <w:p>
+            <w:r>
+              <w:t>CONTROLLED</w:t>
+            </w:r>
+          </w:p>
+        </w:tc>
+      </w:tr>
+    </w:tbl>
+    <w:p>
+      <w:pPr>
+        <w:pStyle w:val="Heading1"/>
+      </w:pPr>
+      <w:r>
+        <w:t>Table of Contents</w:t>
+      </w:r>
+    </w:p>
+    <w:p>
+      <w:r>
+        <w:t>1. Cover Page</w:t>
+      </w:r>
+    </w:p>
+    <w:p>
+      <w:r>
+        <w:t>2. Engineering Control Record</w:t>
+      </w:r>
+    </w:p>
+    <w:p>
+      <w:r>
+        <w:t>3. Revision History</w:t>
+      </w:r>
+    </w:p>
+    <w:p>
+      <w:r>
+        <w:t>4. Table of Contents</w:t>
+      </w:r>
+    </w:p>
+    <w:p>
+      <w:r>
+        <w:t>5. Purpose</w:t>
+      </w:r>
+    </w:p>
+    <w:p>
+      <w:r>
+        <w:t>6. Vision</w:t>
+      </w:r>
+    </w:p>
+    <w:p>
+      <w:r>
+        <w:t>7. Mission</w:t>
+      </w:r>
+    </w:p>
+    <w:p>
+      <w:r>
+        <w:t>8. Strategic Objectives</w:t>
+      </w:r>
+    </w:p>
+    <w:p>
+      <w:r>
+        <w:t>9. Programme Scope</w:t>
+      </w:r>
+    </w:p>
+    <w:p>
+      <w:r>
+        <w:t>10. Programme Governance</w:t>
+      </w:r>
+    </w:p>
+    <w:p>
+      <w:r>
+        <w:t>11. Guiding Principles</w:t>
+      </w:r>
+    </w:p>
+    <w:p>
+      <w:r>
+        <w:t>12. Success Criteria</w:t>
+      </w:r>
+    </w:p>
+    <w:p>
+      <w:r>
+        <w:t>13. Related Documents</w:t>
+      </w:r>
+    </w:p>
+    <w:p>
+      <w:r>
+        <w:t>14. Appendices</w:t>
+      </w:r>
+    </w:p>
+    <w:p>
+      <w:pPr>
+        <w:pStyle w:val="Heading1"/>
+      </w:pPr>
+      <w:r>
+        <w:t>Purpose</w:t>
+      </w:r>
+    </w:p>
+    <w:p>
+      <w:r>
+        <w:t>Define the authority, purpose and governance of the JustDefenders programme.</w:t>
+      </w:r>
+    </w:p>
+    <w:p>
+      <w:pPr>
+        <w:pStyle w:val="Heading1"/>
+      </w:pPr>
+      <w:r>
+        <w:t>Vision</w:t>
+      </w:r>
+    </w:p>
+    <w:p>
+      <w:r>
+        <w:t>To build the world's leading intelligence platform for the global Land Rover Defender community.</w:t>
+      </w:r>
+    </w:p>
+    <w:p>
+      <w:pPr>
+        <w:pStyle w:val="Heading1"/>
+      </w:pPr>
+      <w:r>
+        <w:t>Mission</w:t>
+      </w:r>
+    </w:p>
+    <w:p>
+      <w:r>
+        <w:t>Deliver a secure, reliable, scalable and commercially sustainable platform providing Defender owners, clubs and suppliers with world-class intelligence, collaboration and operational capability.</w:t>
+      </w:r>
+    </w:p>
+    <w:p>
+      <w:pPr>
+        <w:pStyle w:val="Heading1"/>
+      </w:pPr>
+      <w:r>
+        <w:t>Strategic Objectives</w:t>
+      </w:r>
+    </w:p>
+    <w:p>
+      <w:pPr>
+        <w:pStyle w:val="ListBullet"/>
+      </w:pPr>
+      <w:r>
+        <w:t>Deliver the Foundation Engineering baseline.</w:t>
+      </w:r>
+    </w:p>
+    <w:p>
+      <w:pPr>
+        <w:pStyle w:val="ListBullet"/>
+      </w:pPr>
+      <w:r>
+        <w:t>Achieve Alpha.</w:t>
+      </w:r>
+    </w:p>
+    <w:p>
+      <w:pPr>
+        <w:pStyle w:val="ListBullet"/>
+      </w:pPr>
+      <w:r>
+        <w:t>Validate with real users.</w:t>
+      </w:r>
+    </w:p>
+    <w:p>
+      <w:pPr>
+        <w:pStyle w:val="ListBullet"/>
+      </w:pPr>
+      <w:r>
+        <w:t>Deliver Beta.</w:t>
+      </w:r>
+    </w:p>
+    <w:p>
+      <w:pPr>
+        <w:pStyle w:val="ListBullet"/>
+      </w:pPr>
+      <w:r>
+        <w:t>Achieve Production readiness.</w:t>
+      </w:r>
+    </w:p>
+    <w:p>
+      <w:pPr>
+        <w:pStyle w:val="ListBullet"/>
+      </w:pPr>
+      <w:r>
+        <w:t>Build a sustainable supplier ecosystem.</w:t>
+      </w:r>
+    </w:p>
+    <w:p>
+      <w:pPr>
+        <w:pStyle w:val="ListBullet"/>
+      </w:pPr>
+      <w:r>
+        <w:t>Enable passive commercial income.</w:t>
+      </w:r>
+    </w:p>
+    <w:p>
+      <w:pPr>
+        <w:pStyle w:val="ListBullet"/>
+      </w:pPr>
+      <w:r>
+        <w:t>Preserve engineering quality and recoverability.</w:t>
+      </w:r>
+    </w:p>
+    <w:p>
+      <w:pPr>
+        <w:pStyle w:val="Heading1"/>
+      </w:pPr>
+      <w:r>
+        <w:t>Programme Scope</w:t>
+      </w:r>
+    </w:p>
+    <w:p>
+      <w:r>
+        <w:t>The programme encompasses governance, engineering, platform delivery, operational capability, controlled documentation, and supporting engineering artefacts required to deliver the JustDefenders platform.</w:t>
+      </w:r>
+    </w:p>
+    <w:p>
+      <w:pPr>
+        <w:pStyle w:val="Heading1"/>
+      </w:pPr>
+      <w:r>
+        <w:t>Programme Governance</w:t>
+      </w:r>
+    </w:p>
+    <w:p>
+      <w:r>
+        <w:t>The Programme Office governs the programme. Engineering Work Packages deliver approved artefacts.</w:t>
+      </w:r>
+    </w:p>
+    <w:p>
+      <w:pPr>
+        <w:pStyle w:val="Heading1"/>
+      </w:pPr>
+      <w:r>
+        <w:t>Guiding Principles</w:t>
+      </w:r>
+    </w:p>
+    <w:p>
+      <w:pPr>
+        <w:pStyle w:val="ListBullet"/>
+      </w:pPr>
+      <w:r>
+        <w:t>Engineering before enthusiasm.</w:t>
+      </w:r>
+    </w:p>
+    <w:p>
+      <w:pPr>
+        <w:pStyle w:val="ListBullet"/>
+      </w:pPr>
+      <w:r>
+        <w:t>One work package at a time.</w:t>
+      </w:r>
+    </w:p>
+    <w:p>
+      <w:pPr>
+        <w:pStyle w:val="ListBullet"/>
+      </w:pPr>
+      <w:r>
+        <w:t>One authoritative source.</w:t>
+      </w:r>
+    </w:p>
+    <w:p>
+      <w:pPr>
+        <w:pStyle w:val="ListBullet"/>
+      </w:pPr>
+      <w:r>
+        <w:t>Recovery must always be possible.</w:t>
+      </w:r>
+    </w:p>
+    <w:p>
+      <w:pPr>
+        <w:pStyle w:val="ListBullet"/>
+      </w:pPr>
+      <w:r>
+        <w:t>No single point of failure.</w:t>
+      </w:r>
+    </w:p>
+    <w:p>
+      <w:pPr>
+        <w:pStyle w:val="ListBullet"/>
+      </w:pPr>
+      <w:r>
+        <w:t>Every artefact under engineering control.</w:t>
+      </w:r>
+    </w:p>
+    <w:p>
+      <w:pPr>
+        <w:pStyle w:val="Heading1"/>
+      </w:pPr>
+      <w:r>
+        <w:t>Success Criteria</w:t>
+      </w:r>
+    </w:p>
+    <w:tbl>
+      <w:tblPr>
+        <w:tblStyle w:val="TableGrid"/>
+        <w:tblW w:type="auto" w:w="0"/>
+        <w:tblLook w:firstColumn="1" w:firstRow="1" w:lastColumn="0" w:lastRow="0" w:noHBand="0" w:noVBand="1" w:val="04A0"/>
+      </w:tblPr>
+      <w:tblGrid>
+        <w:gridCol w:w="4320"/>
+        <w:gridCol w:w="4320"/>
+      </w:tblGrid>
+      <w:tr>
+        <w:tc>
+          <w:tcPr>
+            <w:tcW w:type="dxa" w:w="4320"/>
+          </w:tcPr>
+          <w:p>
+            <w:r>
+              <w:t>Stage</w:t>
             </w:r>
           </w:p>
         </w:tc>
@@ -101,7 +718,7 @@
           </w:tcPr>
           <w:p>
             <w:r>
-              <w:t>ProgrammeManagement\00 Programme Office\</w:t>
+              <w:t>Success Measure</w:t>
             </w:r>
           </w:p>
         </w:tc>
@@ -113,7 +730,7 @@
           </w:tcPr>
           <w:p>
             <w:r>
-              <w:t>Owner</w:t>
+              <w:t>Foundation</w:t>
             </w:r>
           </w:p>
         </w:tc>
@@ -123,7 +740,7 @@
           </w:tcPr>
           <w:p>
             <w:r>
-              <w:t>Programme Office</w:t>
+              <w:t>Foundation Engineering baseline established.</w:t>
             </w:r>
           </w:p>
         </w:tc>
@@ -135,7 +752,7 @@
           </w:tcPr>
           <w:p>
             <w:r>
-              <w:t>Version</w:t>
+              <w:t>Alpha</w:t>
             </w:r>
           </w:p>
         </w:tc>
@@ -145,7 +762,7 @@
           </w:tcPr>
           <w:p>
             <w:r>
-              <w:t>1.0</w:t>
+              <w:t>Core engineering capabilities validated.</w:t>
             </w:r>
           </w:p>
         </w:tc>
@@ -157,7 +774,7 @@
           </w:tcPr>
           <w:p>
             <w:r>
-              <w:t>Date</w:t>
+              <w:t>Beta</w:t>
             </w:r>
           </w:p>
         </w:tc>
@@ -167,12 +784,64 @@
           </w:tcPr>
           <w:p>
             <w:r>
-              <w:t>02 August 2026</w:t>
+              <w:t>Validated with representative users and stable feature set.</w:t>
+            </w:r>
+          </w:p>
+        </w:tc>
+      </w:tr>
+      <w:tr>
+        <w:tc>
+          <w:tcPr>
+            <w:tcW w:type="dxa" w:w="4320"/>
+          </w:tcPr>
+          <w:p>
+            <w:r>
+              <w:t>Production</w:t>
+            </w:r>
+          </w:p>
+        </w:tc>
+        <w:tc>
+          <w:tcPr>
+            <w:tcW w:type="dxa" w:w="4320"/>
+          </w:tcPr>
+          <w:p>
+            <w:r>
+              <w:t>Production-ready platform with sustainable operational governance.</w:t>
             </w:r>
           </w:p>
         </w:tc>
       </w:tr>
     </w:tbl>
+    <w:p>
+      <w:pPr>
+        <w:pStyle w:val="Heading1"/>
+      </w:pPr>
+      <w:r>
+        <w:t>Related Documents</w:t>
+      </w:r>
+    </w:p>
+    <w:p>
+      <w:r>
+        <w:t>Engineering Policies</w:t>
+        <w:br/>
+        <w:t>Engineering Configuration Management Database (ECMDB)</w:t>
+        <w:br/>
+        <w:t>Engineering Work Packages</w:t>
+      </w:r>
+    </w:p>
+    <w:p>
+      <w:pPr>
+        <w:pStyle w:val="Heading1"/>
+      </w:pPr>
+      <w:r>
+        <w:t>Appendices</w:t>
+      </w:r>
+    </w:p>
+    <w:p>
+      <w:r>
+        <w:t>None.</w:t>
+      </w:r>
+    </w:p>
     <w:sectPr>
       <w:pgSz w:w="12240" w:h="15840"/>
       <w:pgMar w:top="1440" w:right="1800" w:bottom="1440" w:left="1800" w:header="720" w:footer="720" w:gutter="0"/>

</xml_diff>